<commit_message>
Fix: saltos de pagina dentro de parrafo para que Word abra el .docx
Co-Authored-By: Claude Opus 4.8 <noreply@anthropic.com>
</commit_message>
<xml_diff>
--- a/MANUAL-SUPERUSUARIO.docx
+++ b/MANUAL-SUPERUSUARIO.docx
@@ -238,9 +238,11 @@
         <w:t xml:space="preserve">Auditar el uso de la plataforma</w:t>
       </w:r>
     </w:p>
-    <w:r>
-      <w:br w:type="page"/>
-    </w:r>
+    <w:p>
+      <w:r>
+        <w:br w:type="page"/>
+      </w:r>
+    </w:p>
     <w:p>
       <w:pPr>
         <w:pStyle w:val="Heading1"/>
@@ -2507,9 +2509,11 @@
         </w:tc>
       </w:tr>
     </w:tbl>
-    <w:r>
-      <w:br w:type="page"/>
-    </w:r>
+    <w:p>
+      <w:r>
+        <w:br w:type="page"/>
+      </w:r>
+    </w:p>
     <w:p>
       <w:pPr>
         <w:pStyle w:val="Heading1"/>
@@ -3105,9 +3109,11 @@
         <w:t xml:space="preserve">Las claves de Cloudflare se reutilizan entre consultoras: un solo widget, agregás el dominio nuevo.</w:t>
       </w:r>
     </w:p>
-    <w:r>
-      <w:br w:type="page"/>
-    </w:r>
+    <w:p>
+      <w:r>
+        <w:br w:type="page"/>
+      </w:r>
+    </w:p>
     <w:p>
       <w:pPr>
         <w:pStyle w:val="Heading1"/>
@@ -3867,9 +3873,11 @@
         <w:t xml:space="preserve">¿Hay ⚫ o 🔴? → Tocá 'Health' → analiza el error</w:t>
       </w:r>
     </w:p>
-    <w:r>
-      <w:br w:type="page"/>
-    </w:r>
+    <w:p>
+      <w:r>
+        <w:br w:type="page"/>
+      </w:r>
+    </w:p>
     <w:p>
       <w:pPr>
         <w:pStyle w:val="Heading1"/>
@@ -4734,9 +4742,11 @@
         <w:t xml:space="preserve">Si ella tampoco puede, es problema del servidor</w:t>
       </w:r>
     </w:p>
-    <w:r>
-      <w:br w:type="page"/>
-    </w:r>
+    <w:p>
+      <w:r>
+        <w:br w:type="page"/>
+      </w:r>
+    </w:p>
     <w:p>
       <w:pPr>
         <w:pStyle w:val="Heading1"/>
@@ -4954,9 +4964,11 @@
         </w:tc>
       </w:tr>
     </w:tbl>
-    <w:r>
-      <w:br w:type="page"/>
-    </w:r>
+    <w:p>
+      <w:r>
+        <w:br w:type="page"/>
+      </w:r>
+    </w:p>
     <w:p>
       <w:pPr>
         <w:pStyle w:val="Heading1"/>
@@ -5709,9 +5721,11 @@
         <w:t xml:space="preserve">Google Drive → guardar CVs en el Drive de la consultora</w:t>
       </w:r>
     </w:p>
-    <w:r>
-      <w:br w:type="page"/>
-    </w:r>
+    <w:p>
+      <w:r>
+        <w:br w:type="page"/>
+      </w:r>
+    </w:p>
     <w:p>
       <w:pPr>
         <w:pStyle w:val="Heading1"/>

</xml_diff>

<commit_message>
Admin de la consultora gestiona sus usuarios y selectores
- /admin/usuarios visible para admin (no solo super_admin); Consola sigue solo super_admin
- Admin asigna roles consultora/selector; admin/super_admin reservados a super_admin
- Cuentas admin/super_admin protegidas (solo lectura, sin eliminar) para un admin
- Guards server-side en crear/actualizar/eliminar usuario (no se confia en el cliente)
- Migracion 0008: trigger proteger_cambio_rol permite a admin gestionar roles no elevados
- Manual y .docx actualizados (matriz de roles + gestion de usuarios)

Co-Authored-By: Claude Opus 4.8 <noreply@anthropic.com>
</commit_message>
<xml_diff>
--- a/MANUAL-SUPERUSUARIO.docx
+++ b/MANUAL-SUPERUSUARIO.docx
@@ -605,7 +605,7 @@
                 <w:sz w:val="20"/>
                 <w:szCs w:val="20"/>
               </w:rPr>
-              <w:t xml:space="preserve">Casi todo: empresas, búsquedas, selectores, postulantes, talentos, kanban, comisiones, garantías, KPIs y Configuración. NO: gestión de usuarios/roles ni Consola</w:t>
+              <w:t xml:space="preserve">Casi todo: empresas, búsquedas, selectores, postulantes, talentos, kanban, comisiones, garantías, KPIs, Configuración y Usuarios de su consultora (roles consultora y selector). NO: asignar roles admin/super_admin ni la Consola</w:t>
             </w:r>
           </w:p>
         </w:tc>
@@ -4788,20 +4788,20 @@
         <w:spacing w:after="80"/>
       </w:pPr>
       <w:r>
-        <w:t xml:space="preserve">Entrá a la consultora (desde Consola, tocá 'Panel')</w:t>
-      </w:r>
-    </w:p>
-    <w:p>
-      <w:pPr>
-        <w:pStyle w:val="ListParagraph"/>
-        <w:numPr>
-          <w:ilvl w:val="0"/>
-          <w:numId w:val="2"/>
-        </w:numPr>
-        <w:spacing w:after="80"/>
-      </w:pPr>
-      <w:r>
-        <w:t xml:space="preserve">Abrí Usuarios (solo ves si sos super_admin)</w:t>
+        <w:t xml:space="preserve">Quién entra a Usuarios: el admin de la consultora Y el super_admin. Cada consultora se autogestiona.</w:t>
+      </w:r>
+    </w:p>
+    <w:p>
+      <w:pPr>
+        <w:pStyle w:val="ListParagraph"/>
+        <w:numPr>
+          <w:ilvl w:val="0"/>
+          <w:numId w:val="2"/>
+        </w:numPr>
+        <w:spacing w:after="80"/>
+      </w:pPr>
+      <w:r>
+        <w:t xml:space="preserve">Abrí Usuarios en el menú lateral</w:t>
       </w:r>
     </w:p>
     <w:p>
@@ -4841,19 +4841,6 @@
       </w:pPr>
       <w:r>
         <w:t xml:space="preserve">Tocá 'Crear usuario'</w:t>
-      </w:r>
-    </w:p>
-    <w:p>
-      <w:pPr>
-        <w:pStyle w:val="ListParagraph"/>
-        <w:numPr>
-          <w:ilvl w:val="0"/>
-          <w:numId w:val="2"/>
-        </w:numPr>
-        <w:spacing w:after="80"/>
-      </w:pPr>
-      <w:r>
-        <w:t xml:space="preserve">La app envía un email de invitación automáticamente</w:t>
       </w:r>
     </w:p>
     <w:p>
@@ -4865,33 +4852,84 @@
           <w:b/>
           <w:bCs/>
         </w:rPr>
-        <w:t xml:space="preserve">Roles disponibles:</w:t>
-      </w:r>
-    </w:p>
-    <w:p>
-      <w:pPr>
-        <w:pStyle w:val="ListParagraph"/>
-        <w:numPr>
-          <w:ilvl w:val="0"/>
-          <w:numId w:val="2"/>
-        </w:numPr>
-        <w:spacing w:after="80"/>
-      </w:pPr>
-      <w:r>
-        <w:t xml:space="preserve">admin: acceso total al panel incluida Configuración; NO gestiona usuarios/roles ni Consola</w:t>
-      </w:r>
-    </w:p>
-    <w:p>
-      <w:pPr>
-        <w:pStyle w:val="ListParagraph"/>
-        <w:numPr>
-          <w:ilvl w:val="0"/>
-          <w:numId w:val="2"/>
-        </w:numPr>
-        <w:spacing w:after="80"/>
-      </w:pPr>
-      <w:r>
-        <w:t xml:space="preserve">usuario: panel pero sin KPIs ni garantías</w:t>
+        <w:t xml:space="preserve">Roles que puede asignar cada uno:</w:t>
+      </w:r>
+    </w:p>
+    <w:p>
+      <w:pPr>
+        <w:pStyle w:val="ListParagraph"/>
+        <w:numPr>
+          <w:ilvl w:val="0"/>
+          <w:numId w:val="2"/>
+        </w:numPr>
+        <w:spacing w:after="80"/>
+      </w:pPr>
+      <w:r>
+        <w:t xml:space="preserve">admin (cliente): Consultora, Selector</w:t>
+      </w:r>
+    </w:p>
+    <w:p>
+      <w:pPr>
+        <w:pStyle w:val="ListParagraph"/>
+        <w:numPr>
+          <w:ilvl w:val="0"/>
+          <w:numId w:val="2"/>
+        </w:numPr>
+        <w:spacing w:after="80"/>
+      </w:pPr>
+      <w:r>
+        <w:t xml:space="preserve">super_admin (Palantiri): Super Administrador, Administrador, Consultora, Selector</w:t>
+      </w:r>
+    </w:p>
+    <w:p>
+      <w:pPr>
+        <w:pStyle w:val="ListParagraph"/>
+        <w:numPr>
+          <w:ilvl w:val="0"/>
+          <w:numId w:val="2"/>
+        </w:numPr>
+        <w:spacing w:after="80"/>
+      </w:pPr>
+      <w:r>
+        <w:t xml:space="preserve">Los roles admin/super_admin son exclusivos del super_admin: un admin no puede asignarlos ni tocar cuentas que los tengan (protección anti-escalada).</w:t>
+      </w:r>
+    </w:p>
+    <w:p>
+      <w:pPr>
+        <w:spacing w:after="120"/>
+      </w:pPr>
+      <w:r>
+        <w:rPr>
+          <w:b/>
+          <w:bCs/>
+        </w:rPr>
+        <w:t xml:space="preserve">Qué hace cada rol:</w:t>
+      </w:r>
+    </w:p>
+    <w:p>
+      <w:pPr>
+        <w:pStyle w:val="ListParagraph"/>
+        <w:numPr>
+          <w:ilvl w:val="0"/>
+          <w:numId w:val="2"/>
+        </w:numPr>
+        <w:spacing w:after="80"/>
+      </w:pPr>
+      <w:r>
+        <w:t xml:space="preserve">admin: acceso total al panel, incluida Configuración y la gestión de usuarios consultora/selector de su consultora</w:t>
+      </w:r>
+    </w:p>
+    <w:p>
+      <w:pPr>
+        <w:pStyle w:val="ListParagraph"/>
+        <w:numPr>
+          <w:ilvl w:val="0"/>
+          <w:numId w:val="2"/>
+        </w:numPr>
+        <w:spacing w:after="80"/>
+      </w:pPr>
+      <w:r>
+        <w:t xml:space="preserve">consultora (usuario): panel pero sin KPIs ni garantías</w:t>
       </w:r>
     </w:p>
     <w:p>

</xml_diff>